<commit_message>
Site public complet prêt pour Cloudflare Pages
- site/build.py : construit dist/ (accueil, CGV, confidentialité, mandat,
  mentions légales, 404, robots, sitemap, en-têtes de sécurité, image de partage)
  depuis les sources juridiques Markdown ; refuse de publier si une valeur
  obligatoire manque ; mode --apercu pour prévisualiser
- site/config.json : valeurs publiées (identité de la société, sous-traitants)
- juridique/variables.py : variables et blocs conditionnels partagés entre
  documents Word et site (téléphone, TVA, assurance, médiateur, ligne 2FA
  facultatifs, formulations adaptées)
- Formulaire : envoi par la messagerie du visiteur tant que Formspree n'est
  pas configuré
- Politique de confidentialité et registre : hébergeur du site ajouté
- 27 tests, vnu et html-validate sans erreur, Lighthouse 97-100

Co-Authored-By: Claude Opus 5.5 <noreply@anthropic.com>
Claude-Session: https://claude.ai/code/session_01Y1ccwmnSo11YFZ7zwBaNdA
</commit_message>
<xml_diff>
--- a/juridique/politique-confidentialite.docx
+++ b/juridique/politique-confidentialite.docx
@@ -1636,6 +1636,74 @@
                 <w:b w:val="0"/>
                 <w:sz w:val="19"/>
               </w:rPr>
+              <w:t>{{HEBERGEUR_NOM}}</w:t>
+            </w:r>
+          </w:p>
+        </w:tc>
+        <w:tc>
+          <w:tcPr>
+            <w:tcW w:type="dxa" w:w="3137"/>
+          </w:tcPr>
+          <w:p>
+            <w:pPr>
+              <w:spacing w:after="40"/>
+            </w:pPr>
+            <w:r>
+              <w:rPr>
+                <w:sz w:val="19"/>
+              </w:rPr>
+            </w:r>
+            <w:r>
+              <w:rPr>
+                <w:b w:val="0"/>
+                <w:sz w:val="19"/>
+              </w:rPr>
+              <w:t>Hébergement et diffusion du site internet</w:t>
+            </w:r>
+          </w:p>
+        </w:tc>
+        <w:tc>
+          <w:tcPr>
+            <w:tcW w:type="dxa" w:w="3137"/>
+          </w:tcPr>
+          <w:p>
+            <w:pPr>
+              <w:spacing w:after="40"/>
+            </w:pPr>
+            <w:r>
+              <w:rPr>
+                <w:sz w:val="19"/>
+              </w:rPr>
+            </w:r>
+            <w:r>
+              <w:rPr>
+                <w:b w:val="0"/>
+                <w:sz w:val="19"/>
+              </w:rPr>
+              <w:t>{{HEBERGEUR_LOCALISATION}}</w:t>
+            </w:r>
+          </w:p>
+        </w:tc>
+      </w:tr>
+      <w:tr>
+        <w:tc>
+          <w:tcPr>
+            <w:tcW w:type="dxa" w:w="3137"/>
+          </w:tcPr>
+          <w:p>
+            <w:pPr>
+              <w:spacing w:after="40"/>
+            </w:pPr>
+            <w:r>
+              <w:rPr>
+                <w:sz w:val="19"/>
+              </w:rPr>
+            </w:r>
+            <w:r>
+              <w:rPr>
+                <w:b w:val="0"/>
+                <w:sz w:val="19"/>
+              </w:rPr>
               <w:t>Formspree ({{FORMSPREE_ENTITE}})</w:t>
             </w:r>
           </w:p>

</xml_diff>